<commit_message>
Deposit the Cheng and Ayres (2008) growth draft; confirm authorship in every citation
The owner confirmed on 2026-10-17 that Henry Cheng and Dan Ayres
(WDFW) wrote the 2008 draft and that it may be deposited. The .doc and
an antiword text extraction are in docs/references/ with a provenance
README; LibreOffice could not render a PDF of the file. Every
'authorship to confirm' is replaced by the confirmed citation (growth
review, manuscript references, AGENTS.md, task.md T7, notebook header),
and the harvest-monitoring review no longer describes Cheng and Kuk
(2002) as an internal report: it is the published Biometrics method,
and the parameters are from the deposited draft.

Co-Authored-By: Claude Fable 5.1 <noreply@anthropic.com>
Claude-Session: https://claude.ai/code/session_01L4UTtQLGqosvD2YERijBwF
</commit_message>
<xml_diff>
--- a/manuscript/manuscript.docx
+++ b/manuscript/manuscript.docx
@@ -7151,7 +7151,7 @@
         <w:pStyle w:val="Compact"/>
       </w:pPr>
       <w:r>
-        <w:t xml:space="preserve">Cheng YW, Ayres D [authorship to confirm] (2008) Modelling the growth of razor clam (</w:t>
+        <w:t xml:space="preserve">Cheng YW, Ayres D (2008) Modelling the growth of razor clam (</w:t>
       </w:r>
       <w:r>
         <w:rPr>
@@ -7161,7 +7161,16 @@
         <w:t xml:space="preserve">Siliqua patula</w:t>
       </w:r>
       <w:r>
-        <w:t xml:space="preserve">) in Washington State coast. Unpublished draft, Washington Department of Fish and Wildlife, Olympia</w:t>
+        <w:t xml:space="preserve">) in Washington State coast. Unpublished draft, Washington Department of Fish and Wildlife, Olympia. Deposited in the project repository (</w:t>
+      </w:r>
+      <w:r>
+        <w:rPr>
+          <w:rStyle w:val="VerbatimChar"/>
+        </w:rPr>
+        <w:t xml:space="preserve">docs/references/</w:t>
+      </w:r>
+      <w:r>
+        <w:t xml:space="preserve">)</w:t>
       </w:r>
       <w:r>
         <w:t xml:space="preserve"> </w:t>
@@ -7177,7 +7186,7 @@
         <w:t xml:space="preserve"> </w:t>
       </w:r>
       <w:r>
-        <w:t xml:space="preserve">(read in full; the file names no authors)</w:t>
+        <w:t xml:space="preserve">(read in full; authorship confirmed by the authors’ agency)</w:t>
       </w:r>
     </w:p>
     <w:p>

</xml_diff>

<commit_message>
Pipeline outputs with the corrected inputs and new sensitivities; expected key numbers for the regression check
Full run (2,000 surrogates, 272 s). The date corrections change no median
survey date, so every result is unchanged; the beach-level SST (vii) and
density (viii) tables, the habitat-area table and the report are new or
refreshed. 01_code/R/tests/expected_key_numbers.csv now holds 27 values
recorded from this run (57 checks pass). Word file regenerated.

Co-Authored-By: Claude Fable 5.1 <noreply@anthropic.com>
Claude-Session: https://claude.ai/code/session_01L4UTtQLGqosvD2YERijBwF
</commit_message>
<xml_diff>
--- a/manuscript/manuscript.docx
+++ b/manuscript/manuscript.docx
@@ -993,6 +993,37 @@
       </w:r>
       <w:r>
         <w:t xml:space="preserve">We computed the median date of measured clams for each beach-year. Two beach-years without usable dates (Kalaloch 2001; Copalis 2003, which has no length records) were assigned the beach median. Trends in survey day of year were estimated by least squares.</w:t>
+      </w:r>
+    </w:p>
+    <w:p>
+      <w:pPr>
+        <w:numPr>
+          <w:ilvl w:val="0"/>
+          <w:numId w:val="1006"/>
+        </w:numPr>
+        <w:pStyle w:val="Compact"/>
+      </w:pPr>
+      <w:r>
+        <w:rPr>
+          <w:bCs/>
+          <w:b/>
+        </w:rPr>
+        <w:t xml:space="preserve">Data corrections.</w:t>
+      </w:r>
+      <w:r>
+        <w:t xml:space="preserve"> </w:t>
+      </w:r>
+      <w:r>
+        <w:t xml:space="preserve">The 218,101 length records carried dates in three encodings, and 711 records in six beach-years carried a year that differed from the survey year (one of them 2028) while their month-day fell inside the window of correctly dated records of the same survey; we parsed the dates to one encoding and set those years to the survey year in a corrected copy of the file, leaving the source untouched and logging every change (</w:t>
+      </w:r>
+      <w:r>
+        <w:rPr>
+          <w:rStyle w:val="VerbatimChar"/>
+        </w:rPr>
+        <w:t xml:space="preserve">02_data/corrected/CHANGELOG.md</w:t>
+      </w:r>
+      <w:r>
+        <w:t xml:space="preserve">). Three records with lengths outside 3–180 mm were excluded. The 910 Kalaloch 2001 records have no date in the source and received that beach’s median survey date. No correction changed a median survey date.</w:t>
       </w:r>
     </w:p>
     <w:p>
@@ -2160,7 +2191,31 @@
         <w:pStyle w:val="Compact"/>
       </w:pPr>
       <w:r>
-        <w:t xml:space="preserve">the length-based year classes (the year-old cohort at survey Y+1 and the two-year-olds at survey Y+2, Section 2.2) in place of the size classes, with Holm adjustment within that set of 10 tests and the same covariates.</w:t>
+        <w:t xml:space="preserve">the length-based year classes (the year-old cohort at survey Y+1 and the two-year-olds at survey Y+2, Section 2.2) in place of the size classes, with Holm adjustment within that set of 10 tests and the same covariates;</w:t>
+      </w:r>
+    </w:p>
+    <w:p>
+      <w:pPr>
+        <w:numPr>
+          <w:ilvl w:val="1"/>
+          <w:numId w:val="1011"/>
+        </w:numPr>
+        <w:pStyle w:val="Compact"/>
+      </w:pPr>
+      <w:r>
+        <w:t xml:space="preserve">beach-level satellite SST in place of the regional buoy anomaly: the NOAA OISST pixel (0.25°, from 1982) and the JPL MUR box (1 km, from 2002) off each beach over the same May–September window, which in the pooled model also carry within-year contrasts between beaches;</w:t>
+      </w:r>
+    </w:p>
+    <w:p>
+      <w:pPr>
+        <w:numPr>
+          <w:ilvl w:val="1"/>
+          <w:numId w:val="1011"/>
+        </w:numPr>
+        <w:pStyle w:val="Compact"/>
+      </w:pPr>
+      <w:r>
+        <w:t xml:space="preserve">density in place of abundance: the estimates divided by the habitat area used to expand them (which changes in steps within every beach, by up to 30% at Twin Harbors), for the responses and the spawner covariate alike.</w:t>
       </w:r>
     </w:p>
     <w:p>
@@ -2523,12 +2578,24 @@
         <w:t xml:space="preserve">[C]</w:t>
       </w:r>
       <w:r>
-        <w:t xml:space="preserve">) and lme4. Code and derived data are in the accompanying repository (</w:t>
+        <w:t xml:space="preserve">) and lme4 (versions recorded in the repository’s</w:t>
+      </w:r>
+      <w:r>
+        <w:t xml:space="preserve"> </w:t>
       </w:r>
       <w:r>
         <w:rPr>
           <w:rStyle w:val="VerbatimChar"/>
         </w:rPr>
+        <w:t xml:space="preserve">renv.lock</w:t>
+      </w:r>
+      <w:r>
+        <w:t xml:space="preserve">). Code and derived data are in the accompanying repository (</w:t>
+      </w:r>
+      <w:r>
+        <w:rPr>
+          <w:rStyle w:val="VerbatimChar"/>
+        </w:rPr>
         <w:t xml:space="preserve">01_code/R/</w:t>
       </w:r>
       <w:r>
@@ -2544,7 +2611,7 @@
         <w:t xml:space="preserve">02_data/derived/</w:t>
       </w:r>
       <w:r>
-        <w:t xml:space="preserve">); the full pipeline runs in about 8 minutes, and random seeds are fixed.</w:t>
+        <w:t xml:space="preserve">); the full pipeline runs in about 9 minutes, random seeds are fixed, and a continuous-integration workflow reruns it and checks a set of key numbers against recorded values on every change.</w:t>
       </w:r>
     </w:p>
     <w:bookmarkEnd w:id="26"/>
@@ -3845,6 +3912,72 @@
     <w:p>
       <w:pPr>
         <w:pStyle w:val="FirstParagraph"/>
+      </w:pPr>
+      <w:r>
+        <w:rPr>
+          <w:bCs/>
+          <w:b/>
+        </w:rPr>
+        <w:t xml:space="preserve">Beach-level satellite SST (sensitivity vii)</w:t>
+      </w:r>
+      <w:r>
+        <w:t xml:space="preserve"> </w:t>
+      </w:r>
+      <w:r>
+        <w:t xml:space="preserve">[</w:t>
+      </w:r>
+      <w:r>
+        <w:rPr>
+          <w:rStyle w:val="VerbatimChar"/>
+        </w:rPr>
+        <w:t xml:space="preserve">confirmatory_sst_beachlevel.csv</w:t>
+      </w:r>
+      <w:r>
+        <w:t xml:space="preserve">]. Replacing the regional buoy anomaly with the OISST pixel or the MUR box off each beach did not change the null SST result: on pre-recruits +0.04 per SD (p = 0.70) and +0.10 (p = 0.52) against +0.05 (p = 0.71) for the regional series; on recruits −0.05 to +0.05 (p ≥ 0.44); the same without Kalaloch. Beach-level temperature therefore adds nothing that the regional series missed, including within-year differences between beaches.</w:t>
+      </w:r>
+    </w:p>
+    <w:p>
+      <w:pPr>
+        <w:pStyle w:val="BodyText"/>
+      </w:pPr>
+      <w:r>
+        <w:rPr>
+          <w:bCs/>
+          <w:b/>
+        </w:rPr>
+        <w:t xml:space="preserve">Density instead of abundance (sensitivity viii)</w:t>
+      </w:r>
+      <w:r>
+        <w:t xml:space="preserve"> </w:t>
+      </w:r>
+      <w:r>
+        <w:t xml:space="preserve">[</w:t>
+      </w:r>
+      <w:r>
+        <w:rPr>
+          <w:rStyle w:val="VerbatimChar"/>
+        </w:rPr>
+        <w:t xml:space="preserve">confirmatory_density_vs_abundance.csv</w:t>
+      </w:r>
+      <w:r>
+        <w:t xml:space="preserve">,</w:t>
+      </w:r>
+      <w:r>
+        <w:t xml:space="preserve"> </w:t>
+      </w:r>
+      <w:r>
+        <w:rPr>
+          <w:rStyle w:val="VerbatimChar"/>
+        </w:rPr>
+        <w:t xml:space="preserve">habitat_area_changes.csv</w:t>
+      </w:r>
+      <w:r>
+        <w:t xml:space="preserve">]. On the density scale no estimate moved by more than 0.013 log units per SD: BEUTI on pre-recruits was −0.30 (coastwide −0.61 ± 0.20, Holm p = 0.055) and freshet discharge on recruits +0.20 (p = 0.006, Holm p = 0.06). The step changes in habitat area do not drive any result.</w:t>
+      </w:r>
+    </w:p>
+    <w:p>
+      <w:pPr>
+        <w:pStyle w:val="BodyText"/>
       </w:pPr>
       <w:r>
         <w:rPr>

</xml_diff>